<commit_message>
Update organizer contact email
</commit_message>
<xml_diff>
--- a/Rhythm_in_Motion_正式計畫書.docx
+++ b/Rhythm_in_Motion_正式計畫書.docx
@@ -554,7 +554,7 @@
         <w:pStyle w:val="1"/>
         <w:spacing w:before="340"/>
       </w:pPr>
-      <w:bookmarkStart w:id="0" w:name="_Toc240634357"/>
+      <w:bookmarkStart w:id="0" w:name="_Toc240638582"/>
       <w:r>
         <w:lastRenderedPageBreak/>
         <w:t>文件摘要</w:t>
@@ -715,7 +715,7 @@
         <w:pStyle w:val="2"/>
         <w:spacing w:before="220"/>
       </w:pPr>
-      <w:bookmarkStart w:id="1" w:name="_Toc240634358"/>
+      <w:bookmarkStart w:id="1" w:name="_Toc240638583"/>
       <w:r>
         <w:t>計畫一覽</w:t>
       </w:r>
@@ -1078,7 +1078,7 @@
                 <w:sz w:val="19"/>
                 <w:szCs w:val="19"/>
               </w:rPr>
-              <w:t>cn922082000@gmail.com</w:t>
+              <w:t>yichengstudio@gmail.com</w:t>
             </w:r>
           </w:p>
         </w:tc>
@@ -1557,7 +1557,7 @@
         <w:pStyle w:val="1"/>
         <w:spacing w:before="340"/>
       </w:pPr>
-      <w:bookmarkStart w:id="2" w:name="_Toc240634359"/>
+      <w:bookmarkStart w:id="2" w:name="_Toc240638584"/>
       <w:r>
         <w:t>目錄</w:t>
       </w:r>
@@ -1566,7 +1566,7 @@
     <w:sdt>
       <w:sdtPr>
         <w:alias w:val="目錄"/>
-        <w:id w:val="1626730886"/>
+        <w:id w:val="-1542508030"/>
       </w:sdtPr>
       <w:sdtEndPr/>
       <w:sdtContent>
@@ -1595,7 +1595,7 @@
           <w:r>
             <w:fldChar w:fldCharType="separate"/>
           </w:r>
-          <w:hyperlink w:anchor="_Toc240634357" w:history="1">
+          <w:hyperlink w:anchor="_Toc240638582" w:history="1">
             <w:r>
               <w:rPr>
                 <w:rStyle w:val="a5"/>
@@ -1620,7 +1620,7 @@
               <w:rPr>
                 <w:noProof/>
               </w:rPr>
-              <w:instrText xml:space="preserve"> PAGEREF _Toc240634357 \h </w:instrText>
+              <w:instrText xml:space="preserve"> PAGEREF _Toc240638582 \h </w:instrText>
             </w:r>
             <w:r>
               <w:rPr>
@@ -1664,7 +1664,7 @@
               <w14:ligatures w14:val="standardContextual"/>
             </w:rPr>
           </w:pPr>
-          <w:hyperlink w:anchor="_Toc240634358" w:history="1">
+          <w:hyperlink w:anchor="_Toc240638583" w:history="1">
             <w:r>
               <w:rPr>
                 <w:rStyle w:val="a5"/>
@@ -1689,7 +1689,7 @@
               <w:rPr>
                 <w:noProof/>
               </w:rPr>
-              <w:instrText xml:space="preserve"> PAGEREF _Toc240634358 \h </w:instrText>
+              <w:instrText xml:space="preserve"> PAGEREF _Toc240638583 \h </w:instrText>
             </w:r>
             <w:r>
               <w:rPr>
@@ -1732,7 +1732,7 @@
               <w14:ligatures w14:val="standardContextual"/>
             </w:rPr>
           </w:pPr>
-          <w:hyperlink w:anchor="_Toc240634359" w:history="1">
+          <w:hyperlink w:anchor="_Toc240638584" w:history="1">
             <w:r>
               <w:rPr>
                 <w:rStyle w:val="a5"/>
@@ -1757,7 +1757,7 @@
               <w:rPr>
                 <w:noProof/>
               </w:rPr>
-              <w:instrText xml:space="preserve"> PAGEREF _Toc240634359 \h </w:instrText>
+              <w:instrText xml:space="preserve"> PAGEREF _Toc240638584 \h </w:instrText>
             </w:r>
             <w:r>
               <w:rPr>
@@ -1800,7 +1800,7 @@
               <w14:ligatures w14:val="standardContextual"/>
             </w:rPr>
           </w:pPr>
-          <w:hyperlink w:anchor="_Toc240634360" w:history="1">
+          <w:hyperlink w:anchor="_Toc240638585" w:history="1">
             <w:r>
               <w:rPr>
                 <w:rStyle w:val="a5"/>
@@ -1825,7 +1825,7 @@
               <w:rPr>
                 <w:noProof/>
               </w:rPr>
-              <w:instrText xml:space="preserve"> PAGEREF _Toc240634360 \h </w:instrText>
+              <w:instrText xml:space="preserve"> PAGEREF _Toc240638585 \h </w:instrText>
             </w:r>
             <w:r>
               <w:rPr>
@@ -1869,7 +1869,7 @@
               <w14:ligatures w14:val="standardContextual"/>
             </w:rPr>
           </w:pPr>
-          <w:hyperlink w:anchor="_Toc240634361" w:history="1">
+          <w:hyperlink w:anchor="_Toc240638586" w:history="1">
             <w:r>
               <w:rPr>
                 <w:rStyle w:val="a5"/>
@@ -1894,7 +1894,7 @@
               <w:rPr>
                 <w:noProof/>
               </w:rPr>
-              <w:instrText xml:space="preserve"> PAGEREF _Toc240634361 \h </w:instrText>
+              <w:instrText xml:space="preserve"> PAGEREF _Toc240638586 \h </w:instrText>
             </w:r>
             <w:r>
               <w:rPr>
@@ -1938,7 +1938,7 @@
               <w14:ligatures w14:val="standardContextual"/>
             </w:rPr>
           </w:pPr>
-          <w:hyperlink w:anchor="_Toc240634362" w:history="1">
+          <w:hyperlink w:anchor="_Toc240638587" w:history="1">
             <w:r>
               <w:rPr>
                 <w:rStyle w:val="a5"/>
@@ -1963,7 +1963,7 @@
               <w:rPr>
                 <w:noProof/>
               </w:rPr>
-              <w:instrText xml:space="preserve"> PAGEREF _Toc240634362 \h </w:instrText>
+              <w:instrText xml:space="preserve"> PAGEREF _Toc240638587 \h </w:instrText>
             </w:r>
             <w:r>
               <w:rPr>
@@ -2007,7 +2007,7 @@
               <w14:ligatures w14:val="standardContextual"/>
             </w:rPr>
           </w:pPr>
-          <w:hyperlink w:anchor="_Toc240634363" w:history="1">
+          <w:hyperlink w:anchor="_Toc240638588" w:history="1">
             <w:r>
               <w:rPr>
                 <w:rStyle w:val="a5"/>
@@ -2032,7 +2032,7 @@
               <w:rPr>
                 <w:noProof/>
               </w:rPr>
-              <w:instrText xml:space="preserve"> PAGEREF _Toc240634363 \h </w:instrText>
+              <w:instrText xml:space="preserve"> PAGEREF _Toc240638588 \h </w:instrText>
             </w:r>
             <w:r>
               <w:rPr>
@@ -2075,7 +2075,7 @@
               <w14:ligatures w14:val="standardContextual"/>
             </w:rPr>
           </w:pPr>
-          <w:hyperlink w:anchor="_Toc240634364" w:history="1">
+          <w:hyperlink w:anchor="_Toc240638589" w:history="1">
             <w:r>
               <w:rPr>
                 <w:rStyle w:val="a5"/>
@@ -2100,7 +2100,7 @@
               <w:rPr>
                 <w:noProof/>
               </w:rPr>
-              <w:instrText xml:space="preserve"> PAGEREF _Toc240634364 \h </w:instrText>
+              <w:instrText xml:space="preserve"> PAGEREF _Toc240638589 \h </w:instrText>
             </w:r>
             <w:r>
               <w:rPr>
@@ -2144,7 +2144,7 @@
               <w14:ligatures w14:val="standardContextual"/>
             </w:rPr>
           </w:pPr>
-          <w:hyperlink w:anchor="_Toc240634365" w:history="1">
+          <w:hyperlink w:anchor="_Toc240638590" w:history="1">
             <w:r>
               <w:rPr>
                 <w:rStyle w:val="a5"/>
@@ -2169,7 +2169,7 @@
               <w:rPr>
                 <w:noProof/>
               </w:rPr>
-              <w:instrText xml:space="preserve"> PAGEREF _Toc240634365 \h </w:instrText>
+              <w:instrText xml:space="preserve"> PAGEREF _Toc240638590 \h </w:instrText>
             </w:r>
             <w:r>
               <w:rPr>
@@ -2212,7 +2212,7 @@
               <w14:ligatures w14:val="standardContextual"/>
             </w:rPr>
           </w:pPr>
-          <w:hyperlink w:anchor="_Toc240634366" w:history="1">
+          <w:hyperlink w:anchor="_Toc240638591" w:history="1">
             <w:r>
               <w:rPr>
                 <w:rStyle w:val="a5"/>
@@ -2237,7 +2237,7 @@
               <w:rPr>
                 <w:noProof/>
               </w:rPr>
-              <w:instrText xml:space="preserve"> PAGEREF _Toc240634366 \h </w:instrText>
+              <w:instrText xml:space="preserve"> PAGEREF _Toc240638591 \h </w:instrText>
             </w:r>
             <w:r>
               <w:rPr>
@@ -2281,7 +2281,7 @@
               <w14:ligatures w14:val="standardContextual"/>
             </w:rPr>
           </w:pPr>
-          <w:hyperlink w:anchor="_Toc240634367" w:history="1">
+          <w:hyperlink w:anchor="_Toc240638592" w:history="1">
             <w:r>
               <w:rPr>
                 <w:rStyle w:val="a5"/>
@@ -2306,7 +2306,7 @@
               <w:rPr>
                 <w:noProof/>
               </w:rPr>
-              <w:instrText xml:space="preserve"> PAGEREF _Toc240634367 \h </w:instrText>
+              <w:instrText xml:space="preserve"> PAGEREF _Toc240638592 \h </w:instrText>
             </w:r>
             <w:r>
               <w:rPr>
@@ -2350,7 +2350,7 @@
               <w14:ligatures w14:val="standardContextual"/>
             </w:rPr>
           </w:pPr>
-          <w:hyperlink w:anchor="_Toc240634368" w:history="1">
+          <w:hyperlink w:anchor="_Toc240638593" w:history="1">
             <w:r>
               <w:rPr>
                 <w:rStyle w:val="a5"/>
@@ -2375,7 +2375,7 @@
               <w:rPr>
                 <w:noProof/>
               </w:rPr>
-              <w:instrText xml:space="preserve"> PAGEREF _Toc240634368 \h </w:instrText>
+              <w:instrText xml:space="preserve"> PAGEREF _Toc240638593 \h </w:instrText>
             </w:r>
             <w:r>
               <w:rPr>
@@ -2419,7 +2419,7 @@
               <w14:ligatures w14:val="standardContextual"/>
             </w:rPr>
           </w:pPr>
-          <w:hyperlink w:anchor="_Toc240634369" w:history="1">
+          <w:hyperlink w:anchor="_Toc240638594" w:history="1">
             <w:r>
               <w:rPr>
                 <w:rStyle w:val="a5"/>
@@ -2444,7 +2444,7 @@
               <w:rPr>
                 <w:noProof/>
               </w:rPr>
-              <w:instrText xml:space="preserve"> PAGEREF _Toc240634369 \h </w:instrText>
+              <w:instrText xml:space="preserve"> PAGEREF _Toc240638594 \h </w:instrText>
             </w:r>
             <w:r>
               <w:rPr>
@@ -2487,7 +2487,7 @@
               <w14:ligatures w14:val="standardContextual"/>
             </w:rPr>
           </w:pPr>
-          <w:hyperlink w:anchor="_Toc240634370" w:history="1">
+          <w:hyperlink w:anchor="_Toc240638595" w:history="1">
             <w:r>
               <w:rPr>
                 <w:rStyle w:val="a5"/>
@@ -2527,7 +2527,7 @@
               <w:rPr>
                 <w:noProof/>
               </w:rPr>
-              <w:instrText xml:space="preserve"> PAGEREF _Toc240634370 \h </w:instrText>
+              <w:instrText xml:space="preserve"> PAGEREF _Toc240638595 \h </w:instrText>
             </w:r>
             <w:r>
               <w:rPr>
@@ -2571,7 +2571,7 @@
               <w14:ligatures w14:val="standardContextual"/>
             </w:rPr>
           </w:pPr>
-          <w:hyperlink w:anchor="_Toc240634371" w:history="1">
+          <w:hyperlink w:anchor="_Toc240638596" w:history="1">
             <w:r>
               <w:rPr>
                 <w:rStyle w:val="a5"/>
@@ -2611,7 +2611,7 @@
               <w:rPr>
                 <w:noProof/>
               </w:rPr>
-              <w:instrText xml:space="preserve"> PAGEREF _Toc240634371 \h </w:instrText>
+              <w:instrText xml:space="preserve"> PAGEREF _Toc240638596 \h </w:instrText>
             </w:r>
             <w:r>
               <w:rPr>
@@ -2655,7 +2655,7 @@
               <w14:ligatures w14:val="standardContextual"/>
             </w:rPr>
           </w:pPr>
-          <w:hyperlink w:anchor="_Toc240634372" w:history="1">
+          <w:hyperlink w:anchor="_Toc240638597" w:history="1">
             <w:r>
               <w:rPr>
                 <w:rStyle w:val="a5"/>
@@ -2695,7 +2695,7 @@
               <w:rPr>
                 <w:noProof/>
               </w:rPr>
-              <w:instrText xml:space="preserve"> PAGEREF _Toc240634372 \h </w:instrText>
+              <w:instrText xml:space="preserve"> PAGEREF _Toc240638597 \h </w:instrText>
             </w:r>
             <w:r>
               <w:rPr>
@@ -2739,7 +2739,7 @@
               <w14:ligatures w14:val="standardContextual"/>
             </w:rPr>
           </w:pPr>
-          <w:hyperlink w:anchor="_Toc240634373" w:history="1">
+          <w:hyperlink w:anchor="_Toc240638598" w:history="1">
             <w:r>
               <w:rPr>
                 <w:rStyle w:val="a5"/>
@@ -2779,7 +2779,7 @@
               <w:rPr>
                 <w:noProof/>
               </w:rPr>
-              <w:instrText xml:space="preserve"> PAGEREF _Toc240634373 \h </w:instrText>
+              <w:instrText xml:space="preserve"> PAGEREF _Toc240638598 \h </w:instrText>
             </w:r>
             <w:r>
               <w:rPr>
@@ -2823,7 +2823,7 @@
               <w14:ligatures w14:val="standardContextual"/>
             </w:rPr>
           </w:pPr>
-          <w:hyperlink w:anchor="_Toc240634374" w:history="1">
+          <w:hyperlink w:anchor="_Toc240638599" w:history="1">
             <w:r>
               <w:rPr>
                 <w:rStyle w:val="a5"/>
@@ -2878,7 +2878,7 @@
               <w:rPr>
                 <w:noProof/>
               </w:rPr>
-              <w:instrText xml:space="preserve"> PAGEREF _Toc240634374 \h </w:instrText>
+              <w:instrText xml:space="preserve"> PAGEREF _Toc240638599 \h </w:instrText>
             </w:r>
             <w:r>
               <w:rPr>
@@ -2921,7 +2921,7 @@
               <w14:ligatures w14:val="standardContextual"/>
             </w:rPr>
           </w:pPr>
-          <w:hyperlink w:anchor="_Toc240634375" w:history="1">
+          <w:hyperlink w:anchor="_Toc240638600" w:history="1">
             <w:r>
               <w:rPr>
                 <w:rStyle w:val="a5"/>
@@ -2946,7 +2946,7 @@
               <w:rPr>
                 <w:noProof/>
               </w:rPr>
-              <w:instrText xml:space="preserve"> PAGEREF _Toc240634375 \h </w:instrText>
+              <w:instrText xml:space="preserve"> PAGEREF _Toc240638600 \h </w:instrText>
             </w:r>
             <w:r>
               <w:rPr>
@@ -2990,7 +2990,7 @@
               <w14:ligatures w14:val="standardContextual"/>
             </w:rPr>
           </w:pPr>
-          <w:hyperlink w:anchor="_Toc240634376" w:history="1">
+          <w:hyperlink w:anchor="_Toc240638601" w:history="1">
             <w:r>
               <w:rPr>
                 <w:rStyle w:val="a5"/>
@@ -3015,7 +3015,7 @@
               <w:rPr>
                 <w:noProof/>
               </w:rPr>
-              <w:instrText xml:space="preserve"> PAGEREF _Toc240634376 \h </w:instrText>
+              <w:instrText xml:space="preserve"> PAGEREF _Toc240638601 \h </w:instrText>
             </w:r>
             <w:r>
               <w:rPr>
@@ -3059,7 +3059,7 @@
               <w14:ligatures w14:val="standardContextual"/>
             </w:rPr>
           </w:pPr>
-          <w:hyperlink w:anchor="_Toc240634377" w:history="1">
+          <w:hyperlink w:anchor="_Toc240638602" w:history="1">
             <w:r>
               <w:rPr>
                 <w:rStyle w:val="a5"/>
@@ -3084,7 +3084,7 @@
               <w:rPr>
                 <w:noProof/>
               </w:rPr>
-              <w:instrText xml:space="preserve"> PAGEREF _Toc240634377 \h </w:instrText>
+              <w:instrText xml:space="preserve"> PAGEREF _Toc240638602 \h </w:instrText>
             </w:r>
             <w:r>
               <w:rPr>
@@ -3127,7 +3127,7 @@
               <w14:ligatures w14:val="standardContextual"/>
             </w:rPr>
           </w:pPr>
-          <w:hyperlink w:anchor="_Toc240634378" w:history="1">
+          <w:hyperlink w:anchor="_Toc240638603" w:history="1">
             <w:r>
               <w:rPr>
                 <w:rStyle w:val="a5"/>
@@ -3152,7 +3152,7 @@
               <w:rPr>
                 <w:noProof/>
               </w:rPr>
-              <w:instrText xml:space="preserve"> PAGEREF _Toc240634378 \h </w:instrText>
+              <w:instrText xml:space="preserve"> PAGEREF _Toc240638603 \h </w:instrText>
             </w:r>
             <w:r>
               <w:rPr>
@@ -3196,7 +3196,7 @@
               <w14:ligatures w14:val="standardContextual"/>
             </w:rPr>
           </w:pPr>
-          <w:hyperlink w:anchor="_Toc240634379" w:history="1">
+          <w:hyperlink w:anchor="_Toc240638604" w:history="1">
             <w:r>
               <w:rPr>
                 <w:rStyle w:val="a5"/>
@@ -3221,7 +3221,7 @@
               <w:rPr>
                 <w:noProof/>
               </w:rPr>
-              <w:instrText xml:space="preserve"> PAGEREF _Toc240634379 \h </w:instrText>
+              <w:instrText xml:space="preserve"> PAGEREF _Toc240638604 \h </w:instrText>
             </w:r>
             <w:r>
               <w:rPr>
@@ -3265,7 +3265,7 @@
               <w14:ligatures w14:val="standardContextual"/>
             </w:rPr>
           </w:pPr>
-          <w:hyperlink w:anchor="_Toc240634380" w:history="1">
+          <w:hyperlink w:anchor="_Toc240638605" w:history="1">
             <w:r>
               <w:rPr>
                 <w:rStyle w:val="a5"/>
@@ -3290,7 +3290,7 @@
               <w:rPr>
                 <w:noProof/>
               </w:rPr>
-              <w:instrText xml:space="preserve"> PAGEREF _Toc240634380 \h </w:instrText>
+              <w:instrText xml:space="preserve"> PAGEREF _Toc240638605 \h </w:instrText>
             </w:r>
             <w:r>
               <w:rPr>
@@ -3334,7 +3334,7 @@
               <w14:ligatures w14:val="standardContextual"/>
             </w:rPr>
           </w:pPr>
-          <w:hyperlink w:anchor="_Toc240634381" w:history="1">
+          <w:hyperlink w:anchor="_Toc240638606" w:history="1">
             <w:r>
               <w:rPr>
                 <w:rStyle w:val="a5"/>
@@ -3359,7 +3359,7 @@
               <w:rPr>
                 <w:noProof/>
               </w:rPr>
-              <w:instrText xml:space="preserve"> PAGEREF _Toc240634381 \h </w:instrText>
+              <w:instrText xml:space="preserve"> PAGEREF _Toc240638606 \h </w:instrText>
             </w:r>
             <w:r>
               <w:rPr>
@@ -3402,7 +3402,7 @@
               <w14:ligatures w14:val="standardContextual"/>
             </w:rPr>
           </w:pPr>
-          <w:hyperlink w:anchor="_Toc240634382" w:history="1">
+          <w:hyperlink w:anchor="_Toc240638607" w:history="1">
             <w:r>
               <w:rPr>
                 <w:rStyle w:val="a5"/>
@@ -3427,7 +3427,7 @@
               <w:rPr>
                 <w:noProof/>
               </w:rPr>
-              <w:instrText xml:space="preserve"> PAGEREF _Toc240634382 \h </w:instrText>
+              <w:instrText xml:space="preserve"> PAGEREF _Toc240638607 \h </w:instrText>
             </w:r>
             <w:r>
               <w:rPr>
@@ -3471,7 +3471,7 @@
               <w14:ligatures w14:val="standardContextual"/>
             </w:rPr>
           </w:pPr>
-          <w:hyperlink w:anchor="_Toc240634383" w:history="1">
+          <w:hyperlink w:anchor="_Toc240638608" w:history="1">
             <w:r>
               <w:rPr>
                 <w:rStyle w:val="a5"/>
@@ -3496,7 +3496,7 @@
               <w:rPr>
                 <w:noProof/>
               </w:rPr>
-              <w:instrText xml:space="preserve"> PAGEREF _Toc240634383 \h </w:instrText>
+              <w:instrText xml:space="preserve"> PAGEREF _Toc240638608 \h </w:instrText>
             </w:r>
             <w:r>
               <w:rPr>
@@ -3540,7 +3540,7 @@
               <w14:ligatures w14:val="standardContextual"/>
             </w:rPr>
           </w:pPr>
-          <w:hyperlink w:anchor="_Toc240634384" w:history="1">
+          <w:hyperlink w:anchor="_Toc240638609" w:history="1">
             <w:r>
               <w:rPr>
                 <w:rStyle w:val="a5"/>
@@ -3565,7 +3565,7 @@
               <w:rPr>
                 <w:noProof/>
               </w:rPr>
-              <w:instrText xml:space="preserve"> PAGEREF _Toc240634384 \h </w:instrText>
+              <w:instrText xml:space="preserve"> PAGEREF _Toc240638609 \h </w:instrText>
             </w:r>
             <w:r>
               <w:rPr>
@@ -3608,7 +3608,7 @@
               <w14:ligatures w14:val="standardContextual"/>
             </w:rPr>
           </w:pPr>
-          <w:hyperlink w:anchor="_Toc240634385" w:history="1">
+          <w:hyperlink w:anchor="_Toc240638610" w:history="1">
             <w:r>
               <w:rPr>
                 <w:rStyle w:val="a5"/>
@@ -3633,7 +3633,7 @@
               <w:rPr>
                 <w:noProof/>
               </w:rPr>
-              <w:instrText xml:space="preserve"> PAGEREF _Toc240634385 \h </w:instrText>
+              <w:instrText xml:space="preserve"> PAGEREF _Toc240638610 \h </w:instrText>
             </w:r>
             <w:r>
               <w:rPr>
@@ -3677,7 +3677,7 @@
               <w14:ligatures w14:val="standardContextual"/>
             </w:rPr>
           </w:pPr>
-          <w:hyperlink w:anchor="_Toc240634386" w:history="1">
+          <w:hyperlink w:anchor="_Toc240638611" w:history="1">
             <w:r>
               <w:rPr>
                 <w:rStyle w:val="a5"/>
@@ -3702,7 +3702,7 @@
               <w:rPr>
                 <w:noProof/>
               </w:rPr>
-              <w:instrText xml:space="preserve"> PAGEREF _Toc240634386 \h </w:instrText>
+              <w:instrText xml:space="preserve"> PAGEREF _Toc240638611 \h </w:instrText>
             </w:r>
             <w:r>
               <w:rPr>
@@ -3746,7 +3746,7 @@
               <w14:ligatures w14:val="standardContextual"/>
             </w:rPr>
           </w:pPr>
-          <w:hyperlink w:anchor="_Toc240634387" w:history="1">
+          <w:hyperlink w:anchor="_Toc240638612" w:history="1">
             <w:r>
               <w:rPr>
                 <w:rStyle w:val="a5"/>
@@ -3771,7 +3771,7 @@
               <w:rPr>
                 <w:noProof/>
               </w:rPr>
-              <w:instrText xml:space="preserve"> PAGEREF _Toc240634387 \h </w:instrText>
+              <w:instrText xml:space="preserve"> PAGEREF _Toc240638612 \h </w:instrText>
             </w:r>
             <w:r>
               <w:rPr>
@@ -3815,7 +3815,7 @@
               <w14:ligatures w14:val="standardContextual"/>
             </w:rPr>
           </w:pPr>
-          <w:hyperlink w:anchor="_Toc240634388" w:history="1">
+          <w:hyperlink w:anchor="_Toc240638613" w:history="1">
             <w:r>
               <w:rPr>
                 <w:rStyle w:val="a5"/>
@@ -3840,7 +3840,7 @@
               <w:rPr>
                 <w:noProof/>
               </w:rPr>
-              <w:instrText xml:space="preserve"> PAGEREF _Toc240634388 \h </w:instrText>
+              <w:instrText xml:space="preserve"> PAGEREF _Toc240638613 \h </w:instrText>
             </w:r>
             <w:r>
               <w:rPr>
@@ -3883,7 +3883,7 @@
               <w14:ligatures w14:val="standardContextual"/>
             </w:rPr>
           </w:pPr>
-          <w:hyperlink w:anchor="_Toc240634389" w:history="1">
+          <w:hyperlink w:anchor="_Toc240638614" w:history="1">
             <w:r>
               <w:rPr>
                 <w:rStyle w:val="a5"/>
@@ -3908,7 +3908,7 @@
               <w:rPr>
                 <w:noProof/>
               </w:rPr>
-              <w:instrText xml:space="preserve"> PAGEREF _Toc240634389 \h </w:instrText>
+              <w:instrText xml:space="preserve"> PAGEREF _Toc240638614 \h </w:instrText>
             </w:r>
             <w:r>
               <w:rPr>
@@ -3952,7 +3952,7 @@
               <w14:ligatures w14:val="standardContextual"/>
             </w:rPr>
           </w:pPr>
-          <w:hyperlink w:anchor="_Toc240634390" w:history="1">
+          <w:hyperlink w:anchor="_Toc240638615" w:history="1">
             <w:r>
               <w:rPr>
                 <w:rStyle w:val="a5"/>
@@ -3977,7 +3977,7 @@
               <w:rPr>
                 <w:noProof/>
               </w:rPr>
-              <w:instrText xml:space="preserve"> PAGEREF _Toc240634390 \h </w:instrText>
+              <w:instrText xml:space="preserve"> PAGEREF _Toc240638615 \h </w:instrText>
             </w:r>
             <w:r>
               <w:rPr>
@@ -4020,7 +4020,7 @@
               <w14:ligatures w14:val="standardContextual"/>
             </w:rPr>
           </w:pPr>
-          <w:hyperlink w:anchor="_Toc240634391" w:history="1">
+          <w:hyperlink w:anchor="_Toc240638616" w:history="1">
             <w:r>
               <w:rPr>
                 <w:rStyle w:val="a5"/>
@@ -4045,7 +4045,7 @@
               <w:rPr>
                 <w:noProof/>
               </w:rPr>
-              <w:instrText xml:space="preserve"> PAGEREF _Toc240634391 \h </w:instrText>
+              <w:instrText xml:space="preserve"> PAGEREF _Toc240638616 \h </w:instrText>
             </w:r>
             <w:r>
               <w:rPr>
@@ -4088,7 +4088,7 @@
               <w14:ligatures w14:val="standardContextual"/>
             </w:rPr>
           </w:pPr>
-          <w:hyperlink w:anchor="_Toc240634392" w:history="1">
+          <w:hyperlink w:anchor="_Toc240638617" w:history="1">
             <w:r>
               <w:rPr>
                 <w:rStyle w:val="a5"/>
@@ -4113,7 +4113,7 @@
               <w:rPr>
                 <w:noProof/>
               </w:rPr>
-              <w:instrText xml:space="preserve"> PAGEREF _Toc240634392 \h </w:instrText>
+              <w:instrText xml:space="preserve"> PAGEREF _Toc240638617 \h </w:instrText>
             </w:r>
             <w:r>
               <w:rPr>
@@ -4156,7 +4156,7 @@
               <w14:ligatures w14:val="standardContextual"/>
             </w:rPr>
           </w:pPr>
-          <w:hyperlink w:anchor="_Toc240634393" w:history="1">
+          <w:hyperlink w:anchor="_Toc240638618" w:history="1">
             <w:r>
               <w:rPr>
                 <w:rStyle w:val="a5"/>
@@ -4181,7 +4181,7 @@
               <w:rPr>
                 <w:noProof/>
               </w:rPr>
-              <w:instrText xml:space="preserve"> PAGEREF _Toc240634393 \h </w:instrText>
+              <w:instrText xml:space="preserve"> PAGEREF _Toc240638618 \h </w:instrText>
             </w:r>
             <w:r>
               <w:rPr>
@@ -4225,7 +4225,7 @@
         <w:pStyle w:val="1"/>
         <w:spacing w:before="340"/>
       </w:pPr>
-      <w:bookmarkStart w:id="3" w:name="_Toc240634360"/>
+      <w:bookmarkStart w:id="3" w:name="_Toc240638585"/>
       <w:r>
         <w:lastRenderedPageBreak/>
         <w:t>壹、企劃背景與當代藝術理念</w:t>
@@ -4336,7 +4336,7 @@
         <w:pStyle w:val="2"/>
         <w:spacing w:before="220"/>
       </w:pPr>
-      <w:bookmarkStart w:id="4" w:name="_Toc240634361"/>
+      <w:bookmarkStart w:id="4" w:name="_Toc240638586"/>
       <w:r>
         <w:t>一、策展式命題</w:t>
       </w:r>
@@ -4427,7 +4427,7 @@
         <w:pStyle w:val="2"/>
         <w:spacing w:before="220"/>
       </w:pPr>
-      <w:bookmarkStart w:id="5" w:name="_Toc240634362"/>
+      <w:bookmarkStart w:id="5" w:name="_Toc240638587"/>
       <w:r>
         <w:t>二、計畫目標</w:t>
       </w:r>
@@ -4542,7 +4542,7 @@
         <w:pStyle w:val="2"/>
         <w:spacing w:before="220"/>
       </w:pPr>
-      <w:bookmarkStart w:id="6" w:name="_Toc240634363"/>
+      <w:bookmarkStart w:id="6" w:name="_Toc240638588"/>
       <w:r>
         <w:lastRenderedPageBreak/>
         <w:t>三、核心成果指標</w:t>
@@ -5044,7 +5044,7 @@
         <w:pStyle w:val="1"/>
         <w:spacing w:before="340"/>
       </w:pPr>
-      <w:bookmarkStart w:id="7" w:name="_Toc240634364"/>
+      <w:bookmarkStart w:id="7" w:name="_Toc240638589"/>
       <w:r>
         <w:t>貳、活動基本資訊與組織架構</w:t>
       </w:r>
@@ -5407,7 +5407,7 @@
                 <w:sz w:val="19"/>
                 <w:szCs w:val="19"/>
               </w:rPr>
-              <w:t>cn922082000@gmail.com</w:t>
+              <w:t>yichengstudio@gmail.com</w:t>
             </w:r>
           </w:p>
         </w:tc>
@@ -5890,7 +5890,7 @@
         <w:pStyle w:val="2"/>
         <w:spacing w:before="220"/>
       </w:pPr>
-      <w:bookmarkStart w:id="8" w:name="_Toc240634365"/>
+      <w:bookmarkStart w:id="8" w:name="_Toc240638590"/>
       <w:r>
         <w:t>一、工作分工</w:t>
       </w:r>
@@ -6503,7 +6503,7 @@
         <w:pStyle w:val="1"/>
         <w:spacing w:before="340"/>
       </w:pPr>
-      <w:bookmarkStart w:id="9" w:name="_Toc240634366"/>
+      <w:bookmarkStart w:id="9" w:name="_Toc240638591"/>
       <w:r>
         <w:t>參、參與對象、入場與安全原則</w:t>
       </w:r>
@@ -6514,7 +6514,7 @@
         <w:pStyle w:val="2"/>
         <w:spacing w:before="220"/>
       </w:pPr>
-      <w:bookmarkStart w:id="10" w:name="_Toc240634367"/>
+      <w:bookmarkStart w:id="10" w:name="_Toc240638592"/>
       <w:r>
         <w:t>一、參與對象與身體自主</w:t>
       </w:r>
@@ -6613,7 +6613,7 @@
         <w:pStyle w:val="2"/>
         <w:spacing w:before="220"/>
       </w:pPr>
-      <w:bookmarkStart w:id="11" w:name="_Toc240634368"/>
+      <w:bookmarkStart w:id="11" w:name="_Toc240638593"/>
       <w:r>
         <w:t>二、容納與入場規則</w:t>
       </w:r>
@@ -6725,7 +6725,7 @@
         <w:pStyle w:val="2"/>
         <w:spacing w:before="220"/>
       </w:pPr>
-      <w:bookmarkStart w:id="12" w:name="_Toc240634369"/>
+      <w:bookmarkStart w:id="12" w:name="_Toc240638594"/>
       <w:r>
         <w:t>三、場館維護規範</w:t>
       </w:r>
@@ -6800,7 +6800,7 @@
         <w:pStyle w:val="1"/>
         <w:spacing w:before="340"/>
       </w:pPr>
-      <w:bookmarkStart w:id="13" w:name="_Toc240634370"/>
+      <w:bookmarkStart w:id="13" w:name="_Toc240638595"/>
       <w:r>
         <w:t>肆、</w:t>
       </w:r>
@@ -7789,7 +7789,7 @@
         <w:pStyle w:val="2"/>
         <w:spacing w:before="220"/>
       </w:pPr>
-      <w:bookmarkStart w:id="14" w:name="_Toc240634371"/>
+      <w:bookmarkStart w:id="14" w:name="_Toc240638596"/>
       <w:r>
         <w:t>一、開場與參與契約（</w:t>
       </w:r>
@@ -7848,7 +7848,7 @@
         <w:pStyle w:val="2"/>
         <w:spacing w:before="220"/>
       </w:pPr>
-      <w:bookmarkStart w:id="15" w:name="_Toc240634372"/>
+      <w:bookmarkStart w:id="15" w:name="_Toc240638597"/>
       <w:r>
         <w:t>二、聲音微動態賞析（</w:t>
       </w:r>
@@ -7888,7 +7888,7 @@
         <w:pStyle w:val="2"/>
         <w:spacing w:before="220"/>
       </w:pPr>
-      <w:bookmarkStart w:id="16" w:name="_Toc240634373"/>
+      <w:bookmarkStart w:id="16" w:name="_Toc240638598"/>
       <w:r>
         <w:t>三、集體感官共鳴（</w:t>
       </w:r>
@@ -7964,7 +7964,7 @@
         <w:pStyle w:val="2"/>
         <w:spacing w:before="220"/>
       </w:pPr>
-      <w:bookmarkStart w:id="17" w:name="_Toc240634374"/>
+      <w:bookmarkStart w:id="17" w:name="_Toc240638599"/>
       <w:r>
         <w:t>四、對談、</w:t>
       </w:r>
@@ -8022,7 +8022,7 @@
         <w:pStyle w:val="1"/>
         <w:spacing w:before="340"/>
       </w:pPr>
-      <w:bookmarkStart w:id="18" w:name="_Toc240634375"/>
+      <w:bookmarkStart w:id="18" w:name="_Toc240638600"/>
       <w:r>
         <w:t>伍、空間、設備與技術需求</w:t>
       </w:r>
@@ -9093,7 +9093,7 @@
         <w:pStyle w:val="2"/>
         <w:spacing w:before="220"/>
       </w:pPr>
-      <w:bookmarkStart w:id="19" w:name="_Toc240634376"/>
+      <w:bookmarkStart w:id="19" w:name="_Toc240638601"/>
       <w:r>
         <w:t>一、建議空間配置</w:t>
       </w:r>
@@ -9168,7 +9168,7 @@
         <w:pStyle w:val="2"/>
         <w:spacing w:before="220"/>
       </w:pPr>
-      <w:bookmarkStart w:id="20" w:name="_Toc240634377"/>
+      <w:bookmarkStart w:id="20" w:name="_Toc240638602"/>
       <w:r>
         <w:t>二、場勘與彩排確認清單</w:t>
       </w:r>
@@ -9255,7 +9255,7 @@
         <w:pStyle w:val="1"/>
         <w:spacing w:before="340"/>
       </w:pPr>
-      <w:bookmarkStart w:id="21" w:name="_Toc240634378"/>
+      <w:bookmarkStart w:id="21" w:name="_Toc240638603"/>
       <w:r>
         <w:t>陸、報名、候補與個人資料管理</w:t>
       </w:r>
@@ -9266,7 +9266,7 @@
         <w:pStyle w:val="2"/>
         <w:spacing w:before="220"/>
       </w:pPr>
-      <w:bookmarkStart w:id="22" w:name="_Toc240634379"/>
+      <w:bookmarkStart w:id="22" w:name="_Toc240638604"/>
       <w:r>
         <w:t>一、公開報名機制</w:t>
       </w:r>
@@ -9401,7 +9401,7 @@
         <w:pStyle w:val="2"/>
         <w:spacing w:before="220"/>
       </w:pPr>
-      <w:bookmarkStart w:id="23" w:name="_Toc240634380"/>
+      <w:bookmarkStart w:id="23" w:name="_Toc240638605"/>
       <w:r>
         <w:lastRenderedPageBreak/>
         <w:t>二、表單欄位</w:t>
@@ -10304,7 +10304,7 @@
         <w:pStyle w:val="2"/>
         <w:spacing w:before="220"/>
       </w:pPr>
-      <w:bookmarkStart w:id="24" w:name="_Toc240634381"/>
+      <w:bookmarkStart w:id="24" w:name="_Toc240638606"/>
       <w:r>
         <w:t>三、個資與隱私承諾</w:t>
       </w:r>
@@ -10389,7 +10389,7 @@
         <w:rPr>
           <w:rFonts w:eastAsia="微軟正黑體"/>
         </w:rPr>
-        <w:t xml:space="preserve"> cn922082000@gmail.com </w:t>
+        <w:t xml:space="preserve"> yichengstudio@gmail.com </w:t>
       </w:r>
       <w:r>
         <w:rPr>
@@ -10532,7 +10532,7 @@
                 <w:sz w:val="19"/>
                 <w:szCs w:val="19"/>
               </w:rPr>
-              <w:t xml:space="preserve"> cn922082000@gmail.com</w:t>
+              <w:t xml:space="preserve"> yichengstudio@gmail.com</w:t>
             </w:r>
             <w:r>
               <w:rPr>
@@ -10551,7 +10551,7 @@
         <w:pStyle w:val="1"/>
         <w:spacing w:before="340"/>
       </w:pPr>
-      <w:bookmarkStart w:id="25" w:name="_Toc240634382"/>
+      <w:bookmarkStart w:id="25" w:name="_Toc240638607"/>
       <w:r>
         <w:t>柒、風險控管與緊急應變</w:t>
       </w:r>
@@ -11243,7 +11243,7 @@
         <w:pStyle w:val="2"/>
         <w:spacing w:before="220"/>
       </w:pPr>
-      <w:bookmarkStart w:id="26" w:name="_Toc240634383"/>
+      <w:bookmarkStart w:id="26" w:name="_Toc240638608"/>
       <w:r>
         <w:t>一、緊急處置共通原則</w:t>
       </w:r>
@@ -11330,7 +11330,7 @@
         <w:pStyle w:val="2"/>
         <w:spacing w:before="220"/>
       </w:pPr>
-      <w:bookmarkStart w:id="27" w:name="_Toc240634384"/>
+      <w:bookmarkStart w:id="27" w:name="_Toc240638609"/>
       <w:r>
         <w:lastRenderedPageBreak/>
         <w:t>二、活動調整或中止條件</w:t>
@@ -11374,7 +11374,7 @@
         <w:pStyle w:val="1"/>
         <w:spacing w:before="340"/>
       </w:pPr>
-      <w:bookmarkStart w:id="28" w:name="_Toc240634385"/>
+      <w:bookmarkStart w:id="28" w:name="_Toc240638610"/>
       <w:r>
         <w:t>捌、宣傳、公共參與與成果運用</w:t>
       </w:r>
@@ -11385,7 +11385,7 @@
         <w:pStyle w:val="2"/>
         <w:spacing w:before="220"/>
       </w:pPr>
-      <w:bookmarkStart w:id="29" w:name="_Toc240634386"/>
+      <w:bookmarkStart w:id="29" w:name="_Toc240638611"/>
       <w:r>
         <w:t>一、事前公開參與</w:t>
       </w:r>
@@ -11468,7 +11468,7 @@
         <w:pStyle w:val="2"/>
         <w:spacing w:before="220"/>
       </w:pPr>
-      <w:bookmarkStart w:id="30" w:name="_Toc240634387"/>
+      <w:bookmarkStart w:id="30" w:name="_Toc240638612"/>
       <w:r>
         <w:t>二、現場公共性</w:t>
       </w:r>
@@ -11523,7 +11523,7 @@
         <w:pStyle w:val="2"/>
         <w:spacing w:before="220"/>
       </w:pPr>
-      <w:bookmarkStart w:id="31" w:name="_Toc240634388"/>
+      <w:bookmarkStart w:id="31" w:name="_Toc240638613"/>
       <w:r>
         <w:t>三、事後成果</w:t>
       </w:r>
@@ -11566,7 +11566,7 @@
         <w:pStyle w:val="1"/>
         <w:spacing w:before="340"/>
       </w:pPr>
-      <w:bookmarkStart w:id="32" w:name="_Toc240634389"/>
+      <w:bookmarkStart w:id="32" w:name="_Toc240638614"/>
       <w:r>
         <w:t>玖、前置時程與現場工作表</w:t>
       </w:r>
@@ -12650,7 +12650,7 @@
         <w:pStyle w:val="2"/>
         <w:spacing w:before="220"/>
       </w:pPr>
-      <w:bookmarkStart w:id="33" w:name="_Toc240634390"/>
+      <w:bookmarkStart w:id="33" w:name="_Toc240638615"/>
       <w:r>
         <w:t>活動當日關鍵時間點</w:t>
       </w:r>
@@ -13677,7 +13677,7 @@
         <w:pStyle w:val="1"/>
         <w:spacing w:before="340"/>
       </w:pPr>
-      <w:bookmarkStart w:id="34" w:name="_Toc240634391"/>
+      <w:bookmarkStart w:id="34" w:name="_Toc240638616"/>
       <w:r>
         <w:lastRenderedPageBreak/>
         <w:t>拾、館方配合承諾</w:t>
@@ -13769,7 +13769,7 @@
         <w:pStyle w:val="1"/>
         <w:spacing w:before="340"/>
       </w:pPr>
-      <w:bookmarkStart w:id="35" w:name="_Toc240634392"/>
+      <w:bookmarkStart w:id="35" w:name="_Toc240638617"/>
       <w:r>
         <w:t>附錄一、公開報名頁文案</w:t>
       </w:r>
@@ -14054,7 +14054,7 @@
         <w:pStyle w:val="1"/>
         <w:spacing w:before="340"/>
       </w:pPr>
-      <w:bookmarkStart w:id="36" w:name="_Toc240634393"/>
+      <w:bookmarkStart w:id="36" w:name="_Toc240638618"/>
       <w:r>
         <w:lastRenderedPageBreak/>
         <w:t>附錄二、上線前核對清單</w:t>
@@ -14102,7 +14102,7 @@
           <w:sz w:val="18"/>
           <w:szCs w:val="18"/>
         </w:rPr>
-        <w:t xml:space="preserve"> cn922082000@gmail.com</w:t>
+        <w:t xml:space="preserve"> yichengstudio@gmail.com</w:t>
       </w:r>
       <w:r>
         <w:rPr>
@@ -14658,10 +14658,96 @@
 <file path=word/numbering.xml><?xml version="1.0" encoding="utf-8"?>
 <w:numbering xmlns:wpc="http://schemas.microsoft.com/office/word/2010/wordprocessingCanvas" xmlns:cx="http://schemas.microsoft.com/office/drawing/2014/chartex" xmlns:cx1="http://schemas.microsoft.com/office/drawing/2015/9/8/chartex" xmlns:cx2="http://schemas.microsoft.com/office/drawing/2015/10/21/chartex" xmlns:cx3="http://schemas.microsoft.com/office/drawing/2016/5/9/chartex" xmlns:cx4="http://schemas.microsoft.com/office/drawing/2016/5/10/chartex" xmlns:cx5="http://schemas.microsoft.com/office/drawing/2016/5/11/chartex" xmlns:cx6="http://schemas.microsoft.com/office/drawing/2016/5/12/chartex" xmlns:cx7="http://schemas.microsoft.com/office/drawing/2016/5/13/chartex" xmlns:cx8="http://schemas.microsoft.com/office/drawing/2016/5/14/chartex" xmlns:mc="http://schemas.openxmlformats.org/markup-compatibility/2006" xmlns:aink="http://schemas.microsoft.com/office/drawing/2016/ink" xmlns:am3d="http://schemas.microsoft.com/office/drawing/2017/model3d" xmlns:o="urn:schemas-microsoft-com:office:office" xmlns:oel="http://schemas.microsoft.com/office/2019/extlst" xmlns:r="http://schemas.openxmlformats.org/officeDocument/2006/relationships" xmlns:m="http://schemas.openxmlformats.org/officeDocument/2006/math" xmlns:v="urn:schemas-microsoft-com:vml" xmlns:wp14="http://schemas.microsoft.com/office/word/2010/wordprocessingDrawing" xmlns:wp="http://schemas.openxmlformats.org/drawingml/2006/wordprocessingDrawing" xmlns:w10="urn:schemas-microsoft-com:office:word" xmlns:w="http://schemas.openxmlformats.org/wordprocessingml/2006/main" xmlns:w14="http://schemas.microsoft.com/office/word/2010/wordml" xmlns:w15="http://schemas.microsoft.com/office/word/2012/wordml" xmlns:w16cex="http://schemas.microsoft.com/office/word/2018/wordml/cex" xmlns:w16cid="http://schemas.microsoft.com/office/word/2016/wordml/cid" xmlns:w16="http://schemas.microsoft.com/office/word/2018/wordml" xmlns:w16sdtdh="http://schemas.microsoft.com/office/word/2020/wordml/sdtdatahash" xmlns:w16se="http://schemas.microsoft.com/office/word/2015/wordml/symex" xmlns:wpg="http://schemas.microsoft.com/office/word/2010/wordprocessingGroup" xmlns:wpi="http://schemas.microsoft.com/office/word/2010/wordprocessingInk" xmlns:wne="http://schemas.microsoft.com/office/word/2006/wordml" xmlns:wps="http://schemas.microsoft.com/office/word/2010/wordprocessingShape" mc:Ignorable="w14 w15 w16se w16cid w16 w16cex w16sdtdh wp14">
   <w:abstractNum w:abstractNumId="0" w15:restartNumberingAfterBreak="0">
-    <w:nsid w:val="2CCD769D"/>
+    <w:nsid w:val="239C6119"/>
     <w:multiLevelType w:val="hybridMultilevel"/>
-    <w:tmpl w:val="47F61526"/>
-    <w:lvl w:ilvl="0" w:tplc="B5EC96BA">
+    <w:tmpl w:val="7F22C042"/>
+    <w:lvl w:ilvl="0" w:tplc="2200D39E">
+      <w:start w:val="1"/>
+      <w:numFmt w:val="bullet"/>
+      <w:lvlText w:val="●"/>
+      <w:lvlJc w:val="left"/>
+      <w:pPr>
+        <w:ind w:left="720" w:hanging="360"/>
+      </w:pPr>
+    </w:lvl>
+    <w:lvl w:ilvl="1" w:tplc="E70665A2">
+      <w:start w:val="1"/>
+      <w:numFmt w:val="bullet"/>
+      <w:lvlText w:val="○"/>
+      <w:lvlJc w:val="left"/>
+      <w:pPr>
+        <w:ind w:left="1440" w:hanging="360"/>
+      </w:pPr>
+    </w:lvl>
+    <w:lvl w:ilvl="2" w:tplc="73364B2A">
+      <w:start w:val="1"/>
+      <w:numFmt w:val="bullet"/>
+      <w:lvlText w:val="■"/>
+      <w:lvlJc w:val="left"/>
+      <w:pPr>
+        <w:ind w:left="2160" w:hanging="360"/>
+      </w:pPr>
+    </w:lvl>
+    <w:lvl w:ilvl="3" w:tplc="E2149D74">
+      <w:start w:val="1"/>
+      <w:numFmt w:val="bullet"/>
+      <w:lvlText w:val="●"/>
+      <w:lvlJc w:val="left"/>
+      <w:pPr>
+        <w:ind w:left="2880" w:hanging="360"/>
+      </w:pPr>
+    </w:lvl>
+    <w:lvl w:ilvl="4" w:tplc="FE188DB6">
+      <w:start w:val="1"/>
+      <w:numFmt w:val="bullet"/>
+      <w:lvlText w:val="○"/>
+      <w:lvlJc w:val="left"/>
+      <w:pPr>
+        <w:ind w:left="3600" w:hanging="360"/>
+      </w:pPr>
+    </w:lvl>
+    <w:lvl w:ilvl="5" w:tplc="FD40082C">
+      <w:start w:val="1"/>
+      <w:numFmt w:val="bullet"/>
+      <w:lvlText w:val="■"/>
+      <w:lvlJc w:val="left"/>
+      <w:pPr>
+        <w:ind w:left="4320" w:hanging="360"/>
+      </w:pPr>
+    </w:lvl>
+    <w:lvl w:ilvl="6" w:tplc="BD66AC7A">
+      <w:start w:val="1"/>
+      <w:numFmt w:val="bullet"/>
+      <w:lvlText w:val="●"/>
+      <w:lvlJc w:val="left"/>
+      <w:pPr>
+        <w:ind w:left="5040" w:hanging="360"/>
+      </w:pPr>
+    </w:lvl>
+    <w:lvl w:ilvl="7" w:tplc="7584BB5A">
+      <w:start w:val="1"/>
+      <w:numFmt w:val="bullet"/>
+      <w:lvlText w:val="●"/>
+      <w:lvlJc w:val="left"/>
+      <w:pPr>
+        <w:ind w:left="5760" w:hanging="360"/>
+      </w:pPr>
+    </w:lvl>
+    <w:lvl w:ilvl="8" w:tplc="2612CC26">
+      <w:start w:val="1"/>
+      <w:numFmt w:val="bullet"/>
+      <w:lvlText w:val="●"/>
+      <w:lvlJc w:val="left"/>
+      <w:pPr>
+        <w:ind w:left="6480" w:hanging="360"/>
+      </w:pPr>
+    </w:lvl>
+  </w:abstractNum>
+  <w:abstractNum w:abstractNumId="1" w15:restartNumberingAfterBreak="0">
+    <w:nsid w:val="27EA76AB"/>
+    <w:multiLevelType w:val="hybridMultilevel"/>
+    <w:tmpl w:val="A412E064"/>
+    <w:lvl w:ilvl="0" w:tplc="135C1C8E">
       <w:start w:val="1"/>
       <w:numFmt w:val="bullet"/>
       <w:lvlText w:val="•"/>
@@ -14674,7 +14760,7 @@
         <w:color w:val="B95735"/>
       </w:rPr>
     </w:lvl>
-    <w:lvl w:ilvl="1" w:tplc="E5CC43B0">
+    <w:lvl w:ilvl="1" w:tplc="CA14DC72">
       <w:start w:val="1"/>
       <w:numFmt w:val="bullet"/>
       <w:lvlText w:val="◦"/>
@@ -14687,133 +14773,47 @@
         <w:color w:val="667260"/>
       </w:rPr>
     </w:lvl>
-    <w:lvl w:ilvl="2" w:tplc="453C7BCE">
+    <w:lvl w:ilvl="2" w:tplc="BA7CB698">
       <w:numFmt w:val="decimal"/>
       <w:lvlText w:val=""/>
       <w:lvlJc w:val="left"/>
     </w:lvl>
-    <w:lvl w:ilvl="3" w:tplc="199839E4">
+    <w:lvl w:ilvl="3" w:tplc="85F8EE0C">
       <w:numFmt w:val="decimal"/>
       <w:lvlText w:val=""/>
       <w:lvlJc w:val="left"/>
     </w:lvl>
-    <w:lvl w:ilvl="4" w:tplc="6EEAA25A">
+    <w:lvl w:ilvl="4" w:tplc="031249D6">
       <w:numFmt w:val="decimal"/>
       <w:lvlText w:val=""/>
       <w:lvlJc w:val="left"/>
     </w:lvl>
-    <w:lvl w:ilvl="5" w:tplc="EC94B260">
+    <w:lvl w:ilvl="5" w:tplc="29A88178">
       <w:numFmt w:val="decimal"/>
       <w:lvlText w:val=""/>
       <w:lvlJc w:val="left"/>
     </w:lvl>
-    <w:lvl w:ilvl="6" w:tplc="ABA6856A">
+    <w:lvl w:ilvl="6" w:tplc="68585A7C">
       <w:numFmt w:val="decimal"/>
       <w:lvlText w:val=""/>
       <w:lvlJc w:val="left"/>
     </w:lvl>
-    <w:lvl w:ilvl="7" w:tplc="D722D178">
+    <w:lvl w:ilvl="7" w:tplc="DD686498">
       <w:numFmt w:val="decimal"/>
       <w:lvlText w:val=""/>
       <w:lvlJc w:val="left"/>
     </w:lvl>
-    <w:lvl w:ilvl="8" w:tplc="A85C79C6">
+    <w:lvl w:ilvl="8" w:tplc="9118ECDC">
       <w:numFmt w:val="decimal"/>
       <w:lvlText w:val=""/>
       <w:lvlJc w:val="left"/>
     </w:lvl>
   </w:abstractNum>
-  <w:abstractNum w:abstractNumId="1" w15:restartNumberingAfterBreak="0">
-    <w:nsid w:val="660B7595"/>
+  <w:abstractNum w:abstractNumId="2" w15:restartNumberingAfterBreak="0">
+    <w:nsid w:val="440A081B"/>
     <w:multiLevelType w:val="hybridMultilevel"/>
-    <w:tmpl w:val="308E1348"/>
-    <w:lvl w:ilvl="0" w:tplc="F4B8BF12">
-      <w:start w:val="1"/>
-      <w:numFmt w:val="bullet"/>
-      <w:lvlText w:val="●"/>
-      <w:lvlJc w:val="left"/>
-      <w:pPr>
-        <w:ind w:left="720" w:hanging="360"/>
-      </w:pPr>
-    </w:lvl>
-    <w:lvl w:ilvl="1" w:tplc="8536D0FC">
-      <w:start w:val="1"/>
-      <w:numFmt w:val="bullet"/>
-      <w:lvlText w:val="○"/>
-      <w:lvlJc w:val="left"/>
-      <w:pPr>
-        <w:ind w:left="1440" w:hanging="360"/>
-      </w:pPr>
-    </w:lvl>
-    <w:lvl w:ilvl="2" w:tplc="DFC2D196">
-      <w:start w:val="1"/>
-      <w:numFmt w:val="bullet"/>
-      <w:lvlText w:val="■"/>
-      <w:lvlJc w:val="left"/>
-      <w:pPr>
-        <w:ind w:left="2160" w:hanging="360"/>
-      </w:pPr>
-    </w:lvl>
-    <w:lvl w:ilvl="3" w:tplc="E4C4FA38">
-      <w:start w:val="1"/>
-      <w:numFmt w:val="bullet"/>
-      <w:lvlText w:val="●"/>
-      <w:lvlJc w:val="left"/>
-      <w:pPr>
-        <w:ind w:left="2880" w:hanging="360"/>
-      </w:pPr>
-    </w:lvl>
-    <w:lvl w:ilvl="4" w:tplc="E23EEF1C">
-      <w:start w:val="1"/>
-      <w:numFmt w:val="bullet"/>
-      <w:lvlText w:val="○"/>
-      <w:lvlJc w:val="left"/>
-      <w:pPr>
-        <w:ind w:left="3600" w:hanging="360"/>
-      </w:pPr>
-    </w:lvl>
-    <w:lvl w:ilvl="5" w:tplc="BA40A00C">
-      <w:start w:val="1"/>
-      <w:numFmt w:val="bullet"/>
-      <w:lvlText w:val="■"/>
-      <w:lvlJc w:val="left"/>
-      <w:pPr>
-        <w:ind w:left="4320" w:hanging="360"/>
-      </w:pPr>
-    </w:lvl>
-    <w:lvl w:ilvl="6" w:tplc="7376EB22">
-      <w:start w:val="1"/>
-      <w:numFmt w:val="bullet"/>
-      <w:lvlText w:val="●"/>
-      <w:lvlJc w:val="left"/>
-      <w:pPr>
-        <w:ind w:left="5040" w:hanging="360"/>
-      </w:pPr>
-    </w:lvl>
-    <w:lvl w:ilvl="7" w:tplc="2FAC49FE">
-      <w:start w:val="1"/>
-      <w:numFmt w:val="bullet"/>
-      <w:lvlText w:val="●"/>
-      <w:lvlJc w:val="left"/>
-      <w:pPr>
-        <w:ind w:left="5760" w:hanging="360"/>
-      </w:pPr>
-    </w:lvl>
-    <w:lvl w:ilvl="8" w:tplc="0786E690">
-      <w:start w:val="1"/>
-      <w:numFmt w:val="bullet"/>
-      <w:lvlText w:val="●"/>
-      <w:lvlJc w:val="left"/>
-      <w:pPr>
-        <w:ind w:left="6480" w:hanging="360"/>
-      </w:pPr>
-    </w:lvl>
-  </w:abstractNum>
-  <w:abstractNum w:abstractNumId="2" w15:restartNumberingAfterBreak="0">
-    <w:nsid w:val="6F9A35BA"/>
-    <w:multiLevelType w:val="hybridMultilevel"/>
-    <w:tmpl w:val="D48C976C"/>
-    <w:lvl w:ilvl="0" w:tplc="80746AD2">
+    <w:tmpl w:val="4FF607CA"/>
+    <w:lvl w:ilvl="0" w:tplc="249868AC">
       <w:start w:val="1"/>
       <w:numFmt w:val="decimal"/>
       <w:lvlText w:val="%1."/>
@@ -14828,7 +14828,7 @@
         <w:color w:val="B95735"/>
       </w:rPr>
     </w:lvl>
-    <w:lvl w:ilvl="1" w:tplc="912CCAE0">
+    <w:lvl w:ilvl="1" w:tplc="EDC4148E">
       <w:start w:val="1"/>
       <w:numFmt w:val="lowerLetter"/>
       <w:lvlText w:val="%2."/>
@@ -14841,56 +14841,56 @@
         <w:color w:val="667260"/>
       </w:rPr>
     </w:lvl>
-    <w:lvl w:ilvl="2" w:tplc="AAF63432">
+    <w:lvl w:ilvl="2" w:tplc="D248A37C">
       <w:numFmt w:val="decimal"/>
       <w:lvlText w:val=""/>
       <w:lvlJc w:val="left"/>
     </w:lvl>
-    <w:lvl w:ilvl="3" w:tplc="EB8A89EA">
+    <w:lvl w:ilvl="3" w:tplc="42B69832">
       <w:numFmt w:val="decimal"/>
       <w:lvlText w:val=""/>
       <w:lvlJc w:val="left"/>
     </w:lvl>
-    <w:lvl w:ilvl="4" w:tplc="3D1CE250">
+    <w:lvl w:ilvl="4" w:tplc="4A1A38DE">
       <w:numFmt w:val="decimal"/>
       <w:lvlText w:val=""/>
       <w:lvlJc w:val="left"/>
     </w:lvl>
-    <w:lvl w:ilvl="5" w:tplc="DADCEA2C">
+    <w:lvl w:ilvl="5" w:tplc="2708C2C2">
       <w:numFmt w:val="decimal"/>
       <w:lvlText w:val=""/>
       <w:lvlJc w:val="left"/>
     </w:lvl>
-    <w:lvl w:ilvl="6" w:tplc="39D2C02A">
+    <w:lvl w:ilvl="6" w:tplc="111CC478">
       <w:numFmt w:val="decimal"/>
       <w:lvlText w:val=""/>
       <w:lvlJc w:val="left"/>
     </w:lvl>
-    <w:lvl w:ilvl="7" w:tplc="9A008232">
+    <w:lvl w:ilvl="7" w:tplc="B9CAF254">
       <w:numFmt w:val="decimal"/>
       <w:lvlText w:val=""/>
       <w:lvlJc w:val="left"/>
     </w:lvl>
-    <w:lvl w:ilvl="8" w:tplc="2D0A36D6">
+    <w:lvl w:ilvl="8" w:tplc="2B12CEF4">
       <w:numFmt w:val="decimal"/>
       <w:lvlText w:val=""/>
       <w:lvlJc w:val="left"/>
     </w:lvl>
   </w:abstractNum>
-  <w:num w:numId="1" w16cid:durableId="1339653442">
-    <w:abstractNumId w:val="1"/>
+  <w:num w:numId="1" w16cid:durableId="1342705449">
+    <w:abstractNumId w:val="0"/>
     <w:lvlOverride w:ilvl="0">
       <w:startOverride w:val="1"/>
     </w:lvlOverride>
   </w:num>
-  <w:num w:numId="2" w16cid:durableId="3943499">
+  <w:num w:numId="2" w16cid:durableId="597952842">
     <w:abstractNumId w:val="2"/>
     <w:lvlOverride w:ilvl="0">
       <w:startOverride w:val="1"/>
     </w:lvlOverride>
   </w:num>
-  <w:num w:numId="3" w16cid:durableId="1408267062">
-    <w:abstractNumId w:val="0"/>
+  <w:num w:numId="3" w16cid:durableId="1241713249">
+    <w:abstractNumId w:val="1"/>
     <w:lvlOverride w:ilvl="0">
       <w:startOverride w:val="1"/>
     </w:lvlOverride>
@@ -15536,7 +15536,7 @@
     <w:autoRedefine/>
     <w:uiPriority w:val="39"/>
     <w:unhideWhenUsed/>
-    <w:rsid w:val="00E5173D"/>
+    <w:rsid w:val="00AD1919"/>
   </w:style>
   <w:style w:type="paragraph" w:styleId="20">
     <w:name w:val="toc 2"/>
@@ -15545,7 +15545,7 @@
     <w:autoRedefine/>
     <w:uiPriority w:val="39"/>
     <w:unhideWhenUsed/>
-    <w:rsid w:val="00E5173D"/>
+    <w:rsid w:val="00AD1919"/>
     <w:pPr>
       <w:ind w:leftChars="200" w:left="480"/>
     </w:pPr>
@@ -15556,7 +15556,7 @@
     <w:link w:val="ad"/>
     <w:uiPriority w:val="99"/>
     <w:unhideWhenUsed/>
-    <w:rsid w:val="00E5173D"/>
+    <w:rsid w:val="00AD1919"/>
     <w:pPr>
       <w:tabs>
         <w:tab w:val="center" w:pos="4153"/>
@@ -15574,7 +15574,7 @@
     <w:basedOn w:val="a0"/>
     <w:link w:val="ac"/>
     <w:uiPriority w:val="99"/>
-    <w:rsid w:val="00E5173D"/>
+    <w:rsid w:val="00AD1919"/>
     <w:rPr>
       <w:sz w:val="20"/>
       <w:szCs w:val="20"/>
@@ -15586,7 +15586,7 @@
     <w:link w:val="af"/>
     <w:uiPriority w:val="99"/>
     <w:unhideWhenUsed/>
-    <w:rsid w:val="00E5173D"/>
+    <w:rsid w:val="00AD1919"/>
     <w:pPr>
       <w:tabs>
         <w:tab w:val="center" w:pos="4153"/>
@@ -15604,7 +15604,7 @@
     <w:basedOn w:val="a0"/>
     <w:link w:val="ae"/>
     <w:uiPriority w:val="99"/>
-    <w:rsid w:val="00E5173D"/>
+    <w:rsid w:val="00AD1919"/>
     <w:rPr>
       <w:sz w:val="20"/>
       <w:szCs w:val="20"/>

</xml_diff>